<commit_message>
Update ProjectBook and complete data mining guide
</commit_message>
<xml_diff>
--- a/public/downloads/ProjectBook_HeinHtetZaw_YKPT22466.docx
+++ b/public/downloads/ProjectBook_HeinHtetZaw_YKPT22466.docx
@@ -1664,7 +1664,27 @@
           <w:szCs w:val="24"/>
           <w:lang w:val="en-US"/>
         </w:rPr>
-        <w:t>I would like to thank my course instructor, Dr. Hsu Myat MO, for guiding the class through the IS-212 lectures and for answering my questions during lab sessions. The lectures on classification, association rule mining, and model evaluation formed the foundation of this project. The feedback I received during the planning phase helped me avoid several potential mistakes.</w:t>
+        <w:t>I would like to thank my course instructor, Dr. Hsu Myat M</w:t>
+      </w:r>
+      <w:r>
+        <w:rPr>
+          <w:rFonts w:ascii="Times New Roman" w:hAnsi="Times New Roman" w:eastAsia="Times New Roman" w:cs="Times New Roman"/>
+          <w:noProof w:val="0"/>
+          <w:sz w:val="24"/>
+          <w:szCs w:val="24"/>
+          <w:lang w:val="en-US"/>
+        </w:rPr>
+        <w:t>o</w:t>
+      </w:r>
+      <w:r>
+        <w:rPr>
+          <w:rFonts w:ascii="Times New Roman" w:hAnsi="Times New Roman" w:eastAsia="Times New Roman" w:cs="Times New Roman"/>
+          <w:noProof w:val="0"/>
+          <w:sz w:val="24"/>
+          <w:szCs w:val="24"/>
+          <w:lang w:val="en-US"/>
+        </w:rPr>
+        <w:t>, for guiding the class through the IS-212 lectures and for answering my questions during lab sessions. The lectures on classification, association rule mining, and model evaluation formed the foundation of this project. The feedback I received during the planning phase helped me avoid several potential mistakes.</w:t>
       </w:r>
     </w:p>
     <w:p>
@@ -5020,6 +5040,20 @@
         <w:spacing w:before="120" w:beforeAutospacing="off" w:after="120" w:afterAutospacing="off"/>
         <w:ind w:firstLine="720"/>
         <w:jc w:val="left"/>
+        <w:rPr>
+          <w:rFonts w:ascii="Times New Roman" w:hAnsi="Times New Roman" w:eastAsia="Times New Roman" w:cs="Times New Roman"/>
+          <w:noProof w:val="0"/>
+          <w:sz w:val="24"/>
+          <w:szCs w:val="24"/>
+          <w:lang w:val="en-US"/>
+        </w:rPr>
+      </w:pPr>
+    </w:p>
+    <w:p>
+      <w:pPr>
+        <w:spacing w:before="120" w:beforeAutospacing="off" w:after="120" w:afterAutospacing="off"/>
+        <w:ind w:firstLine="720"/>
+        <w:jc w:val="left"/>
       </w:pPr>
       <w:r>
         <w:rPr>
@@ -5031,6 +5065,13 @@
         </w:rPr>
         <w:t>The correlation matrix for the four numeric columns is shown in Figure 2.5. There is a moderate correlation between Popularity and NbPlays, and RatingDeviation correlates negatively with both of these, which is reasonable since a puzzle that has been played thousands of times has a stable and low deviation rating whereas a new puzzle has a high deviation. The rating itself is not strongly correlated with any of the numeric columns, a fact which already suggests that the classification task will not be easy.</w:t>
       </w:r>
+    </w:p>
+    <w:p>
+      <w:pPr>
+        <w:pStyle w:val="Normal"/>
+        <w:ind w:firstLine="720"/>
+        <w:jc w:val="both"/>
+      </w:pPr>
     </w:p>
     <w:p>
       <w:pPr>
@@ -5081,8 +5122,11 @@
     </w:p>
     <w:p>
       <w:pPr>
-        <w:spacing w:before="120" w:beforeAutospacing="off" w:after="120" w:afterAutospacing="off"/>
+        <w:keepNext w:val="1"/>
+        <w:spacing w:before="120" w:beforeAutospacing="off" w:after="120" w:afterAutospacing="off" w:line="300" w:lineRule="auto"/>
         <w:jc w:val="center"/>
+      </w:pPr>
+      <w:r>
         <w:rPr>
           <w:rFonts w:ascii="Times New Roman" w:hAnsi="Times New Roman" w:eastAsia="Times New Roman" w:cs="Times New Roman"/>
           <w:b w:val="1"/>
@@ -5092,35 +5136,14 @@
           <w:szCs w:val="24"/>
           <w:lang w:val="en-US"/>
         </w:rPr>
-      </w:pPr>
-      <w:r>
-        <w:rPr>
-          <w:rFonts w:ascii="Times New Roman" w:hAnsi="Times New Roman" w:eastAsia="Times New Roman" w:cs="Times New Roman"/>
-          <w:b w:val="1"/>
-          <w:bCs w:val="1"/>
-          <w:noProof w:val="0"/>
-          <w:sz w:val="24"/>
-          <w:szCs w:val="24"/>
-          <w:lang w:val="en-US"/>
-        </w:rPr>
         <w:t>Correlation of the numeric columns — Figure 2.5</w:t>
       </w:r>
-    </w:p>
-    <w:p>
-      <w:pPr>
-        <w:pStyle w:val="Normal"/>
-        <w:ind w:firstLine="0"/>
-        <w:jc w:val="center"/>
-        <w:rPr>
-          <w:sz w:val="21"/>
-          <w:szCs w:val="21"/>
-        </w:rPr>
-      </w:pPr>
     </w:p>
     <w:p>
       <w:pPr>
         <w:pStyle w:val="Heading2"/>
         <w:keepNext w:val="1"/>
+        <w:spacing w:before="80" w:after="240" w:line="300" w:lineRule="auto"/>
       </w:pPr>
       <w:bookmarkStart w:name="_Toc1127395400" w:id="438283717"/>
       <w:r>
@@ -5131,69 +5154,151 @@
     </w:p>
     <w:p>
       <w:pPr>
+        <w:pStyle w:val="Heading2"/>
         <w:keepNext w:val="1"/>
-        <w:spacing w:before="120" w:beforeAutospacing="off" w:after="120" w:afterAutospacing="off"/>
-        <w:ind w:firstLine="720"/>
-        <w:jc w:val="left"/>
-      </w:pPr>
-      <w:r>
-        <w:rPr>
-          <w:rFonts w:ascii="Times New Roman" w:hAnsi="Times New Roman" w:eastAsia="Times New Roman" w:cs="Times New Roman"/>
-          <w:noProof w:val="0"/>
-          <w:sz w:val="24"/>
-          <w:szCs w:val="24"/>
-          <w:lang w:val="en-US"/>
-        </w:rPr>
-        <w:t xml:space="preserve">Before building features I checked eight theme tags that describe the solution line rather than the position: mateIn1 to mateIn5 stateBefore feature construction, I reviewed eight theme tags that describe the solution line rather than the position: mateIn1 to mateIn5 indicate the number of moves required, oneMove is implied by mateIn1, and short and long describe the line length. </w:t>
-      </w:r>
-    </w:p>
-    <w:p>
-      <w:pPr>
-        <w:keepNext w:val="1"/>
-        <w:spacing w:before="120" w:beforeAutospacing="off" w:after="120" w:afterAutospacing="off"/>
-        <w:ind w:firstLine="720"/>
-        <w:jc w:val="left"/>
-      </w:pPr>
-      <w:r>
-        <w:rPr>
-          <w:rFonts w:ascii="Times New Roman" w:hAnsi="Times New Roman" w:eastAsia="Times New Roman" w:cs="Times New Roman"/>
-          <w:noProof w:val="0"/>
-          <w:sz w:val="24"/>
-          <w:szCs w:val="24"/>
-          <w:lang w:val="en-US"/>
-        </w:rPr>
-        <w:t>These tags are tautological because they reveal the answer length, making it easier to classify difficulty without chess knowledge. and veryLong puzzles rises. A model that latches onto these flags would partly learn the answer length instead of the position. I did not remove them from the main feature set, because they are legitimately present in real puzzle metadata, but Chapter 4 contains a dedicated audit (Section 4.6) where all eight tags are removed and the performance drop is measured. This way the model quality with and without the leaking features is known exactly.</w:t>
-      </w:r>
-    </w:p>
-    <w:p>
-      <w:pPr>
-        <w:pStyle w:val="Normal"/>
-        <w:keepNext w:val="1"/>
-        <w:spacing w:before="160"/>
+        <w:spacing w:before="80" w:after="240" w:line="300" w:lineRule="auto"/>
         <w:ind w:firstLine="720"/>
         <w:jc w:val="both"/>
       </w:pPr>
-    </w:p>
-    <w:p>
-      <w:pPr>
-        <w:keepNext/>
-        <w:spacing w:before="160"/>
+      <w:r>
+        <w:rPr>
+          <w:rFonts w:ascii="Times New Roman" w:hAnsi="Times New Roman" w:eastAsia="Times New Roman" w:cs="Times New Roman"/>
+          <w:b w:val="0"/>
+          <w:bCs w:val="0"/>
+          <w:noProof w:val="0"/>
+          <w:sz w:val="24"/>
+          <w:szCs w:val="24"/>
+          <w:lang w:val="en-US"/>
+        </w:rPr>
+        <w:t xml:space="preserve">Eight </w:t>
+      </w:r>
+      <w:r>
+        <w:rPr>
+          <w:rFonts w:ascii="Times New Roman" w:hAnsi="Times New Roman" w:eastAsia="Times New Roman" w:cs="Times New Roman"/>
+          <w:b w:val="0"/>
+          <w:bCs w:val="0"/>
+          <w:noProof w:val="0"/>
+          <w:sz w:val="24"/>
+          <w:szCs w:val="24"/>
+          <w:lang w:val="en-US"/>
+        </w:rPr>
+        <w:t xml:space="preserve">tags are tautological because they reveal the answer length, making it easier to classify difficulty without chess knowledge. and </w:t>
+      </w:r>
+      <w:r>
+        <w:rPr>
+          <w:rFonts w:ascii="Times New Roman" w:hAnsi="Times New Roman" w:eastAsia="Times New Roman" w:cs="Times New Roman"/>
+          <w:b w:val="0"/>
+          <w:bCs w:val="0"/>
+          <w:noProof w:val="0"/>
+          <w:sz w:val="24"/>
+          <w:szCs w:val="24"/>
+          <w:lang w:val="en-US"/>
+        </w:rPr>
+        <w:t>veryLong</w:t>
+      </w:r>
+      <w:r>
+        <w:rPr>
+          <w:rFonts w:ascii="Times New Roman" w:hAnsi="Times New Roman" w:eastAsia="Times New Roman" w:cs="Times New Roman"/>
+          <w:b w:val="0"/>
+          <w:bCs w:val="0"/>
+          <w:noProof w:val="0"/>
+          <w:sz w:val="24"/>
+          <w:szCs w:val="24"/>
+          <w:lang w:val="en-US"/>
+        </w:rPr>
+        <w:t xml:space="preserve"> puzzles </w:t>
+      </w:r>
+      <w:r>
+        <w:rPr>
+          <w:rFonts w:ascii="Times New Roman" w:hAnsi="Times New Roman" w:eastAsia="Times New Roman" w:cs="Times New Roman"/>
+          <w:b w:val="0"/>
+          <w:bCs w:val="0"/>
+          <w:noProof w:val="0"/>
+          <w:sz w:val="24"/>
+          <w:szCs w:val="24"/>
+          <w:lang w:val="en-US"/>
+        </w:rPr>
+        <w:t>rises</w:t>
+      </w:r>
+      <w:r>
+        <w:rPr>
+          <w:rFonts w:ascii="Times New Roman" w:hAnsi="Times New Roman" w:eastAsia="Times New Roman" w:cs="Times New Roman"/>
+          <w:b w:val="0"/>
+          <w:bCs w:val="0"/>
+          <w:noProof w:val="0"/>
+          <w:sz w:val="24"/>
+          <w:szCs w:val="24"/>
+          <w:lang w:val="en-US"/>
+        </w:rPr>
+        <w:t xml:space="preserve">. A model that latches onto these flags would partly learn the answer length instead of the position. I did not remove them from the main feature set, because they are legitimately present in real puzzle metadata, but Chapter 4 </w:t>
+      </w:r>
+      <w:r>
+        <w:rPr>
+          <w:rFonts w:ascii="Times New Roman" w:hAnsi="Times New Roman" w:eastAsia="Times New Roman" w:cs="Times New Roman"/>
+          <w:b w:val="0"/>
+          <w:bCs w:val="0"/>
+          <w:noProof w:val="0"/>
+          <w:sz w:val="24"/>
+          <w:szCs w:val="24"/>
+          <w:lang w:val="en-US"/>
+        </w:rPr>
+        <w:t>contains</w:t>
+      </w:r>
+      <w:r>
+        <w:rPr>
+          <w:rFonts w:ascii="Times New Roman" w:hAnsi="Times New Roman" w:eastAsia="Times New Roman" w:cs="Times New Roman"/>
+          <w:b w:val="0"/>
+          <w:bCs w:val="0"/>
+          <w:noProof w:val="0"/>
+          <w:sz w:val="24"/>
+          <w:szCs w:val="24"/>
+          <w:lang w:val="en-US"/>
+        </w:rPr>
+        <w:t xml:space="preserve"> a dedicated audit (Section 4.6) where all eight tags are </w:t>
+      </w:r>
+      <w:r>
+        <w:rPr>
+          <w:rFonts w:ascii="Times New Roman" w:hAnsi="Times New Roman" w:eastAsia="Times New Roman" w:cs="Times New Roman"/>
+          <w:b w:val="0"/>
+          <w:bCs w:val="0"/>
+          <w:noProof w:val="0"/>
+          <w:sz w:val="24"/>
+          <w:szCs w:val="24"/>
+          <w:lang w:val="en-US"/>
+        </w:rPr>
+        <w:t>removed</w:t>
+      </w:r>
+      <w:r>
+        <w:rPr>
+          <w:rFonts w:ascii="Times New Roman" w:hAnsi="Times New Roman" w:eastAsia="Times New Roman" w:cs="Times New Roman"/>
+          <w:b w:val="0"/>
+          <w:bCs w:val="0"/>
+          <w:noProof w:val="0"/>
+          <w:sz w:val="24"/>
+          <w:szCs w:val="24"/>
+          <w:lang w:val="en-US"/>
+        </w:rPr>
+        <w:t xml:space="preserve"> and the performance drop is measured. This way the model quality with and without the leaking features is known exactly.</w:t>
+      </w:r>
+    </w:p>
+    <w:p>
+      <w:pPr>
+        <w:pStyle w:val="Heading2"/>
+        <w:keepNext w:val="1"/>
+        <w:spacing w:before="80" w:after="240" w:line="300" w:lineRule="auto"/>
         <w:jc w:val="center"/>
       </w:pPr>
       <w:r>
-        <w:rPr>
-          <w:noProof/>
-        </w:rPr>
         <w:drawing>
-          <wp:inline distT="0" distB="0" distL="0" distR="0" wp14:anchorId="23801E6C" wp14:editId="07777777">
+          <wp:inline wp14:editId="1A96B6FA" wp14:anchorId="23801E6C">
             <wp:extent cx="4381500" cy="2019300"/>
             <wp:effectExtent l="0" t="0" r="0" b="0"/>
             <wp:docPr id="1861884985" name="Picture 1861884985"/>
             <wp:cNvGraphicFramePr>
-              <a:graphicFrameLocks xmlns:a="http://schemas.openxmlformats.org/drawingml/2006/main" noChangeAspect="1"/>
+              <a:graphicFrameLocks noChangeAspect="1"/>
             </wp:cNvGraphicFramePr>
-            <a:graphic xmlns:a="http://schemas.openxmlformats.org/drawingml/2006/main">
-              <a:graphicData uri="http://schemas.openxmlformats.org/drawingml/2006/picture">
+            <a:graphic>
+              <a:graphicData xmlns:a="http://schemas.openxmlformats.org/drawingml/2006/main" uri="http://schemas.openxmlformats.org/drawingml/2006/picture">
                 <pic:pic xmlns:pic="http://schemas.openxmlformats.org/drawingml/2006/picture">
                   <pic:nvPicPr>
                     <pic:cNvPr id="0" name=""/>
@@ -5202,7 +5307,7 @@
                     </pic:cNvPicPr>
                   </pic:nvPicPr>
                   <pic:blipFill>
-                    <a:blip r:embed="rId14"/>
+                    <a:blip xmlns:r="http://schemas.openxmlformats.org/officeDocument/2006/relationships" r:embed="rId14"/>
                     <a:srcRect/>
                     <a:stretch>
                       <a:fillRect/>
@@ -5226,80 +5331,54 @@
     </w:p>
     <w:p>
       <w:pPr>
-        <w:keepNext/>
-        <w:spacing w:before="120" w:beforeAutospacing="off" w:after="120" w:afterAutospacing="off" w:line="300" w:lineRule="auto"/>
-        <w:jc w:val="left"/>
-        <w:rPr>
-          <w:rFonts w:ascii="Times New Roman" w:hAnsi="Times New Roman" w:eastAsia="Times New Roman" w:cs="Times New Roman"/>
-          <w:b w:val="1"/>
-          <w:bCs w:val="1"/>
-          <w:noProof w:val="0"/>
-          <w:sz w:val="24"/>
-          <w:szCs w:val="24"/>
-          <w:lang w:val="en-US"/>
-        </w:rPr>
-      </w:pPr>
-      <w:bookmarkStart w:name="_ListF26" w:id="18"/>
-      <w:r>
-        <w:rPr>
-          <w:b w:val="1"/>
-          <w:bCs w:val="1"/>
-          <w:sz w:val="24"/>
-          <w:szCs w:val="24"/>
-        </w:rPr>
-        <w:t xml:space="preserve">Figure 2.6: </w:t>
-      </w:r>
-      <w:bookmarkEnd w:id="18"/>
-      <w:r>
-        <w:rPr>
-          <w:rFonts w:ascii="Times New Roman" w:hAnsi="Times New Roman" w:eastAsia="Times New Roman" w:cs="Times New Roman"/>
-          <w:b w:val="1"/>
-          <w:bCs w:val="1"/>
-          <w:noProof w:val="0"/>
-          <w:sz w:val="24"/>
-          <w:szCs w:val="24"/>
-          <w:lang w:val="en-US"/>
-        </w:rPr>
-        <w:t>The proportion of each solution length theme within each</w:t>
-      </w:r>
-      <w:r>
-        <w:rPr>
-          <w:rFonts w:ascii="Times New Roman" w:hAnsi="Times New Roman" w:eastAsia="Times New Roman" w:cs="Times New Roman"/>
-          <w:b w:val="1"/>
-          <w:bCs w:val="1"/>
-          <w:noProof w:val="0"/>
-          <w:sz w:val="24"/>
-          <w:szCs w:val="24"/>
-          <w:lang w:val="en-US"/>
-        </w:rPr>
-        <w:t xml:space="preserve"> difficulty class</w:t>
-      </w:r>
-    </w:p>
-    <w:p>
-      <w:pPr>
+        <w:pStyle w:val="Heading2"/>
         <w:keepNext w:val="1"/>
         <w:spacing w:before="80" w:after="240" w:line="300" w:lineRule="auto"/>
         <w:jc w:val="center"/>
         <w:rPr>
+          <w:rFonts w:ascii="Times New Roman" w:hAnsi="Times New Roman" w:eastAsia="Times New Roman" w:cs="Times New Roman"/>
           <w:b w:val="1"/>
           <w:bCs w:val="1"/>
-          <w:sz w:val="24"/>
-          <w:szCs w:val="24"/>
-        </w:rPr>
-      </w:pPr>
-    </w:p>
-    <w:p>
-      <w:pPr>
-        <w:pStyle w:val="Normal"/>
-        <w:keepNext/>
-      </w:pPr>
-    </w:p>
-    <w:p>
-      <w:pPr>
-        <w:keepNext/>
-      </w:pPr>
-      <w:r>
-        <w:br w:type="page"/>
+          <w:noProof w:val="0"/>
+          <w:sz w:val="24"/>
+          <w:szCs w:val="24"/>
+          <w:lang w:val="en-US"/>
+        </w:rPr>
+      </w:pPr>
+      <w:bookmarkStart w:name="_ListF26" w:id="18"/>
+      <w:r>
+        <w:rPr>
+          <w:b w:val="1"/>
+          <w:bCs w:val="1"/>
+          <w:sz w:val="24"/>
+          <w:szCs w:val="24"/>
+        </w:rPr>
+        <w:t xml:space="preserve">Figure 2.6: </w:t>
+      </w:r>
+      <w:bookmarkEnd w:id="18"/>
+      <w:r>
+        <w:rPr>
+          <w:rFonts w:ascii="Times New Roman" w:hAnsi="Times New Roman" w:eastAsia="Times New Roman" w:cs="Times New Roman"/>
+          <w:b w:val="1"/>
+          <w:bCs w:val="1"/>
+          <w:noProof w:val="0"/>
+          <w:sz w:val="24"/>
+          <w:szCs w:val="24"/>
+          <w:lang w:val="en-US"/>
+        </w:rPr>
+        <w:t>The proportion of each solution length theme within each</w:t>
+      </w:r>
+      <w:r>
+        <w:rPr>
+          <w:rFonts w:ascii="Times New Roman" w:hAnsi="Times New Roman" w:eastAsia="Times New Roman" w:cs="Times New Roman"/>
+          <w:b w:val="1"/>
+          <w:bCs w:val="1"/>
+          <w:noProof w:val="0"/>
+          <w:sz w:val="24"/>
+          <w:szCs w:val="24"/>
+          <w:lang w:val="en-US"/>
+        </w:rPr>
+        <w:t xml:space="preserve"> difficulty class</w:t>
       </w:r>
     </w:p>
     <w:p>
@@ -13022,18 +13101,6 @@
     </w:p>
     <w:p>
       <w:pPr>
-        <w:ind w:firstLine="0"/>
-        <w:jc w:val="both"/>
-      </w:pPr>
-    </w:p>
-    <w:p>
-      <w:pPr>
-        <w:pStyle w:val="Normal"/>
-        <w:ind/>
-      </w:pPr>
-    </w:p>
-    <w:p>
-      <w:pPr>
         <w:pStyle w:val="Heading2"/>
         <w:spacing w:before="180" w:beforeAutospacing="off" w:after="180" w:afterAutospacing="off"/>
         <w:ind/>
@@ -14846,245 +14913,17 @@
     </w:tbl>
     <w:p>
       <w:pPr>
+        <w:pStyle w:val="Normal"/>
         <w:ind w:firstLine="720"/>
         <w:jc w:val="both"/>
-      </w:pPr>
-    </w:p>
-    <w:p>
-      <w:pPr>
-        <w:keepNext w:val="1"/>
-        <w:spacing w:before="120" w:beforeAutospacing="off" w:after="120" w:afterAutospacing="off"/>
-        <w:ind w:firstLine="720"/>
-        <w:jc w:val="both"/>
-      </w:pPr>
-      <w:r>
-        <w:rPr>
-          <w:rFonts w:ascii="Times New Roman" w:hAnsi="Times New Roman" w:eastAsia="Times New Roman" w:cs="Times New Roman"/>
-          <w:noProof w:val="0"/>
-          <w:sz w:val="24"/>
-          <w:szCs w:val="24"/>
-          <w:lang w:val="en-US"/>
-        </w:rPr>
-        <w:t xml:space="preserve">All five of the mistakes listed in Table 4.5 adhere to the same pattern: the ratings are near a class </w:t>
-      </w:r>
-      <w:r>
-        <w:rPr>
-          <w:rFonts w:ascii="Times New Roman" w:hAnsi="Times New Roman" w:eastAsia="Times New Roman" w:cs="Times New Roman"/>
-          <w:noProof w:val="0"/>
-          <w:sz w:val="24"/>
-          <w:szCs w:val="24"/>
-          <w:lang w:val="en-US"/>
-        </w:rPr>
-        <w:t>boundary</w:t>
-      </w:r>
-      <w:r>
-        <w:rPr>
-          <w:rFonts w:ascii="Times New Roman" w:hAnsi="Times New Roman" w:eastAsia="Times New Roman" w:cs="Times New Roman"/>
-          <w:noProof w:val="0"/>
-          <w:sz w:val="24"/>
-          <w:szCs w:val="24"/>
-          <w:lang w:val="en-US"/>
-        </w:rPr>
-        <w:t xml:space="preserve"> and the predictions differ by exactly one bin. The puzzle rated 1490 which the model classifies as Hard is 110 points below the boundary, while the one rated 2197 and referred to as Hard is 197 points above it. Since no element of the feature set </w:t>
-      </w:r>
-      <w:r>
-        <w:rPr>
-          <w:rFonts w:ascii="Times New Roman" w:hAnsi="Times New Roman" w:eastAsia="Times New Roman" w:cs="Times New Roman"/>
-          <w:noProof w:val="0"/>
-          <w:sz w:val="24"/>
-          <w:szCs w:val="24"/>
-          <w:lang w:val="en-US"/>
-        </w:rPr>
-        <w:t>is able to</w:t>
-      </w:r>
-      <w:r>
-        <w:rPr>
-          <w:rFonts w:ascii="Times New Roman" w:hAnsi="Times New Roman" w:eastAsia="Times New Roman" w:cs="Times New Roman"/>
-          <w:noProof w:val="0"/>
-          <w:sz w:val="24"/>
-          <w:szCs w:val="24"/>
-          <w:lang w:val="en-US"/>
-        </w:rPr>
-        <w:t xml:space="preserve"> distinguish these positions from their </w:t>
-      </w:r>
-      <w:r>
-        <w:rPr>
-          <w:rFonts w:ascii="Times New Roman" w:hAnsi="Times New Roman" w:eastAsia="Times New Roman" w:cs="Times New Roman"/>
-          <w:noProof w:val="0"/>
-          <w:sz w:val="24"/>
-          <w:szCs w:val="24"/>
-          <w:lang w:val="en-US"/>
-        </w:rPr>
-        <w:t>neighbours</w:t>
-      </w:r>
-      <w:r>
-        <w:rPr>
-          <w:rFonts w:ascii="Times New Roman" w:hAnsi="Times New Roman" w:eastAsia="Times New Roman" w:cs="Times New Roman"/>
-          <w:noProof w:val="0"/>
-          <w:sz w:val="24"/>
-          <w:szCs w:val="24"/>
-          <w:lang w:val="en-US"/>
-        </w:rPr>
-        <w:t xml:space="preserve"> on the other side of the boundary, the remaining error is mostly irreducible with respect to this feature set.</w:t>
-      </w:r>
-    </w:p>
-    <w:p>
-      <w:pPr>
-        <w:pStyle w:val="Heading2"/>
-        <w:keepNext w:val="1"/>
-        <w:ind w:firstLine="0"/>
-        <w:jc w:val="both"/>
-      </w:pPr>
-      <w:bookmarkStart w:name="_Toc1407898409" w:id="968870470"/>
-      <w:r>
-        <w:rPr/>
-        <w:t>4.8 The Implemented System</w:t>
-      </w:r>
-      <w:bookmarkEnd w:id="968870470"/>
-    </w:p>
-    <w:p>
-      <w:pPr>
-        <w:keepNext w:val="1"/>
-        <w:spacing w:before="120" w:beforeAutospacing="off" w:after="120" w:afterAutospacing="off"/>
-        <w:ind w:firstLine="720"/>
-        <w:jc w:val="both"/>
-      </w:pPr>
-      <w:r>
-        <w:rPr>
-          <w:rFonts w:ascii="Times New Roman" w:hAnsi="Times New Roman" w:eastAsia="Times New Roman" w:cs="Times New Roman"/>
-          <w:noProof w:val="0"/>
-          <w:sz w:val="24"/>
-          <w:szCs w:val="24"/>
-          <w:lang w:val="en-US"/>
-        </w:rPr>
-        <w:t>The notebook is the deliverable and is organised into six sequential stages which correspond to the sections of this report: data loading, exploratory analysis, preprocessing, association rule mining, model training and evaluation. It connects to Google Drive, reads the CSV from a predetermined path and writes each trained model to a checkpoint folder located in Drive together with a JSON file containing the results of the cross validation. Since each model checks for its own checkpoint file before training begins, the pipeline can be restarted after a interruption by merely rerunning the training cell, and completed models are never recomputed.</w:t>
-      </w:r>
-    </w:p>
-    <w:p>
-      <w:pPr>
-        <w:keepNext w:val="1"/>
-        <w:spacing w:before="120" w:beforeAutospacing="off" w:after="120" w:afterAutospacing="off"/>
-        <w:ind w:firstLine="720"/>
-        <w:jc w:val="both"/>
-      </w:pPr>
-      <w:r>
-        <w:rPr>
-          <w:rFonts w:ascii="Times New Roman" w:hAnsi="Times New Roman" w:eastAsia="Times New Roman" w:cs="Times New Roman"/>
-          <w:noProof w:val="0"/>
-          <w:sz w:val="24"/>
-          <w:szCs w:val="24"/>
-          <w:lang w:val="en-US"/>
-        </w:rPr>
-        <w:t xml:space="preserve">On a standard </w:t>
-      </w:r>
-      <w:r>
-        <w:rPr>
-          <w:rFonts w:ascii="Times New Roman" w:hAnsi="Times New Roman" w:eastAsia="Times New Roman" w:cs="Times New Roman"/>
-          <w:noProof w:val="0"/>
-          <w:sz w:val="24"/>
-          <w:szCs w:val="24"/>
-          <w:lang w:val="en-US"/>
-        </w:rPr>
-        <w:t>Colab</w:t>
-      </w:r>
-      <w:r>
-        <w:rPr>
-          <w:rFonts w:ascii="Times New Roman" w:hAnsi="Times New Roman" w:eastAsia="Times New Roman" w:cs="Times New Roman"/>
-          <w:noProof w:val="0"/>
-          <w:sz w:val="24"/>
-          <w:szCs w:val="24"/>
-          <w:lang w:val="en-US"/>
-        </w:rPr>
-        <w:t xml:space="preserve"> CPU </w:t>
-      </w:r>
-      <w:r>
-        <w:rPr>
-          <w:rFonts w:ascii="Times New Roman" w:hAnsi="Times New Roman" w:eastAsia="Times New Roman" w:cs="Times New Roman"/>
-          <w:noProof w:val="0"/>
-          <w:sz w:val="24"/>
-          <w:szCs w:val="24"/>
-          <w:lang w:val="en-US"/>
-        </w:rPr>
-        <w:t>runtime</w:t>
-      </w:r>
-      <w:r>
-        <w:rPr>
-          <w:rFonts w:ascii="Times New Roman" w:hAnsi="Times New Roman" w:eastAsia="Times New Roman" w:cs="Times New Roman"/>
-          <w:noProof w:val="0"/>
-          <w:sz w:val="24"/>
-          <w:szCs w:val="24"/>
-          <w:lang w:val="en-US"/>
-        </w:rPr>
-        <w:t xml:space="preserve"> a full run from CSV to the final evaluation tables takes under half an hour including preprocessing, and the training phase alone takes </w:t>
-      </w:r>
-      <w:r>
-        <w:rPr>
-          <w:rFonts w:ascii="Times New Roman" w:hAnsi="Times New Roman" w:eastAsia="Times New Roman" w:cs="Times New Roman"/>
-          <w:noProof w:val="0"/>
-          <w:sz w:val="24"/>
-          <w:szCs w:val="24"/>
-          <w:lang w:val="en-US"/>
-        </w:rPr>
-        <w:t>roughly six</w:t>
-      </w:r>
-      <w:r>
-        <w:rPr>
-          <w:rFonts w:ascii="Times New Roman" w:hAnsi="Times New Roman" w:eastAsia="Times New Roman" w:cs="Times New Roman"/>
-          <w:noProof w:val="0"/>
-          <w:sz w:val="24"/>
-          <w:szCs w:val="24"/>
-          <w:lang w:val="en-US"/>
-        </w:rPr>
-        <w:t xml:space="preserve"> to ten minutes with the </w:t>
-      </w:r>
-      <w:r>
-        <w:rPr>
-          <w:rFonts w:ascii="Times New Roman" w:hAnsi="Times New Roman" w:eastAsia="Times New Roman" w:cs="Times New Roman"/>
-          <w:noProof w:val="0"/>
-          <w:sz w:val="24"/>
-          <w:szCs w:val="24"/>
-          <w:lang w:val="en-US"/>
-        </w:rPr>
-        <w:t>optimisations</w:t>
-      </w:r>
-      <w:r>
-        <w:rPr>
-          <w:rFonts w:ascii="Times New Roman" w:hAnsi="Times New Roman" w:eastAsia="Times New Roman" w:cs="Times New Roman"/>
-          <w:noProof w:val="0"/>
-          <w:sz w:val="24"/>
-          <w:szCs w:val="24"/>
-          <w:lang w:val="en-US"/>
-        </w:rPr>
-        <w:t xml:space="preserve"> described in Section 4.2. The notebook, the </w:t>
-      </w:r>
-      <w:r>
-        <w:rPr>
-          <w:rFonts w:ascii="Times New Roman" w:hAnsi="Times New Roman" w:eastAsia="Times New Roman" w:cs="Times New Roman"/>
-          <w:noProof w:val="0"/>
-          <w:sz w:val="24"/>
-          <w:szCs w:val="24"/>
-          <w:lang w:val="en-US"/>
-        </w:rPr>
-        <w:t>dataset</w:t>
-      </w:r>
-      <w:r>
-        <w:rPr>
-          <w:rFonts w:ascii="Times New Roman" w:hAnsi="Times New Roman" w:eastAsia="Times New Roman" w:cs="Times New Roman"/>
-          <w:noProof w:val="0"/>
-          <w:sz w:val="24"/>
-          <w:szCs w:val="24"/>
-          <w:lang w:val="en-US"/>
-        </w:rPr>
-        <w:t xml:space="preserve"> and this report form the complete submission package.</w:t>
-      </w:r>
-    </w:p>
-    <w:p>
-      <w:pPr>
-        <w:keepNext w:val="1"/>
-      </w:pPr>
-      <w:r>
-        <w:br w:type="page"/>
-      </w:r>
+        <w:rPr>
+          <w:rFonts w:ascii="Times New Roman" w:hAnsi="Times New Roman" w:eastAsia="Times New Roman" w:cs="Times New Roman"/>
+          <w:noProof w:val="0"/>
+          <w:sz w:val="24"/>
+          <w:szCs w:val="24"/>
+          <w:lang w:val="en-US"/>
+        </w:rPr>
+      </w:pPr>
     </w:p>
     <w:p>
       <w:pPr>
@@ -15093,19 +14932,243 @@
         <w:spacing w:before="120" w:beforeAutospacing="off" w:after="120" w:afterAutospacing="off"/>
         <w:ind w:firstLine="720"/>
         <w:jc w:val="both"/>
-        <w:rPr>
-          <w:rFonts w:ascii="Times New Roman" w:hAnsi="Times New Roman" w:eastAsia="Times New Roman" w:cs="Times New Roman"/>
-          <w:noProof w:val="0"/>
-          <w:sz w:val="24"/>
-          <w:szCs w:val="24"/>
-          <w:lang w:val="en-US"/>
-        </w:rPr>
-      </w:pPr>
-    </w:p>
-    <w:p>
-      <w:pPr>
+      </w:pPr>
+      <w:r>
+        <w:rPr>
+          <w:rFonts w:ascii="Times New Roman" w:hAnsi="Times New Roman" w:eastAsia="Times New Roman" w:cs="Times New Roman"/>
+          <w:noProof w:val="0"/>
+          <w:sz w:val="24"/>
+          <w:szCs w:val="24"/>
+          <w:lang w:val="en-US"/>
+        </w:rPr>
+        <w:t xml:space="preserve">All five of the mistakes listed in Table 4.5 adhere to the same pattern: the ratings are near a class </w:t>
+      </w:r>
+      <w:r>
+        <w:rPr>
+          <w:rFonts w:ascii="Times New Roman" w:hAnsi="Times New Roman" w:eastAsia="Times New Roman" w:cs="Times New Roman"/>
+          <w:noProof w:val="0"/>
+          <w:sz w:val="24"/>
+          <w:szCs w:val="24"/>
+          <w:lang w:val="en-US"/>
+        </w:rPr>
+        <w:t>boundary</w:t>
+      </w:r>
+      <w:r>
+        <w:rPr>
+          <w:rFonts w:ascii="Times New Roman" w:hAnsi="Times New Roman" w:eastAsia="Times New Roman" w:cs="Times New Roman"/>
+          <w:noProof w:val="0"/>
+          <w:sz w:val="24"/>
+          <w:szCs w:val="24"/>
+          <w:lang w:val="en-US"/>
+        </w:rPr>
+        <w:t xml:space="preserve"> and the predictions differ by exactly one bin. The puzzle rated 1490 which the model classifies as Hard is 110 points below the boundary, while the one rated 2197 and referred to as Hard is 197 points above it. Since no element of the feature set </w:t>
+      </w:r>
+      <w:r>
+        <w:rPr>
+          <w:rFonts w:ascii="Times New Roman" w:hAnsi="Times New Roman" w:eastAsia="Times New Roman" w:cs="Times New Roman"/>
+          <w:noProof w:val="0"/>
+          <w:sz w:val="24"/>
+          <w:szCs w:val="24"/>
+          <w:lang w:val="en-US"/>
+        </w:rPr>
+        <w:t>is able to</w:t>
+      </w:r>
+      <w:r>
+        <w:rPr>
+          <w:rFonts w:ascii="Times New Roman" w:hAnsi="Times New Roman" w:eastAsia="Times New Roman" w:cs="Times New Roman"/>
+          <w:noProof w:val="0"/>
+          <w:sz w:val="24"/>
+          <w:szCs w:val="24"/>
+          <w:lang w:val="en-US"/>
+        </w:rPr>
+        <w:t xml:space="preserve"> distinguish these positions from their </w:t>
+      </w:r>
+      <w:r>
+        <w:rPr>
+          <w:rFonts w:ascii="Times New Roman" w:hAnsi="Times New Roman" w:eastAsia="Times New Roman" w:cs="Times New Roman"/>
+          <w:noProof w:val="0"/>
+          <w:sz w:val="24"/>
+          <w:szCs w:val="24"/>
+          <w:lang w:val="en-US"/>
+        </w:rPr>
+        <w:t>neighbours</w:t>
+      </w:r>
+      <w:r>
+        <w:rPr>
+          <w:rFonts w:ascii="Times New Roman" w:hAnsi="Times New Roman" w:eastAsia="Times New Roman" w:cs="Times New Roman"/>
+          <w:noProof w:val="0"/>
+          <w:sz w:val="24"/>
+          <w:szCs w:val="24"/>
+          <w:lang w:val="en-US"/>
+        </w:rPr>
+        <w:t xml:space="preserve"> on the other side of the boundary, the remaining error is mostly irreducible with respect to this feature set.</w:t>
+      </w:r>
+    </w:p>
+    <w:p>
+      <w:pPr>
+        <w:pStyle w:val="Heading2"/>
         <w:keepNext w:val="1"/>
         <w:ind w:firstLine="0"/>
+        <w:jc w:val="both"/>
+      </w:pPr>
+      <w:bookmarkStart w:name="_Toc1407898409" w:id="968870470"/>
+      <w:r>
+        <w:rPr/>
+        <w:t>4.8 The Implemented System</w:t>
+      </w:r>
+      <w:bookmarkEnd w:id="968870470"/>
+    </w:p>
+    <w:p>
+      <w:pPr>
+        <w:keepNext w:val="1"/>
+        <w:spacing w:before="120" w:beforeAutospacing="off" w:after="120" w:afterAutospacing="off"/>
+        <w:ind w:firstLine="720"/>
+        <w:jc w:val="both"/>
+      </w:pPr>
+      <w:r>
+        <w:rPr>
+          <w:rFonts w:ascii="Times New Roman" w:hAnsi="Times New Roman" w:eastAsia="Times New Roman" w:cs="Times New Roman"/>
+          <w:noProof w:val="0"/>
+          <w:sz w:val="24"/>
+          <w:szCs w:val="24"/>
+          <w:lang w:val="en-US"/>
+        </w:rPr>
+        <w:t>The notebook is the deliverable and is organised into six sequential stages which correspond to the sections of this report: data loading, exploratory analysis, preprocessing, association rule mining, model training and evaluation. It connects to Google Drive, reads the CSV from a predetermined path and writes each trained model to a checkpoint folder located in Drive together with a JSON file containing the results of the cross validation. Since each model checks for its own checkpoint file before training begins, the pipeline can be restarted after a interruption by merely rerunning the training cell, and completed models are never recomputed.</w:t>
+      </w:r>
+    </w:p>
+    <w:p>
+      <w:pPr>
+        <w:keepNext w:val="1"/>
+        <w:spacing w:before="120" w:beforeAutospacing="off" w:after="120" w:afterAutospacing="off"/>
+        <w:ind w:firstLine="720"/>
+        <w:jc w:val="both"/>
+      </w:pPr>
+      <w:r>
+        <w:rPr>
+          <w:rFonts w:ascii="Times New Roman" w:hAnsi="Times New Roman" w:eastAsia="Times New Roman" w:cs="Times New Roman"/>
+          <w:noProof w:val="0"/>
+          <w:sz w:val="24"/>
+          <w:szCs w:val="24"/>
+          <w:lang w:val="en-US"/>
+        </w:rPr>
+        <w:t xml:space="preserve">On a standard </w:t>
+      </w:r>
+      <w:r>
+        <w:rPr>
+          <w:rFonts w:ascii="Times New Roman" w:hAnsi="Times New Roman" w:eastAsia="Times New Roman" w:cs="Times New Roman"/>
+          <w:noProof w:val="0"/>
+          <w:sz w:val="24"/>
+          <w:szCs w:val="24"/>
+          <w:lang w:val="en-US"/>
+        </w:rPr>
+        <w:t>Colab</w:t>
+      </w:r>
+      <w:r>
+        <w:rPr>
+          <w:rFonts w:ascii="Times New Roman" w:hAnsi="Times New Roman" w:eastAsia="Times New Roman" w:cs="Times New Roman"/>
+          <w:noProof w:val="0"/>
+          <w:sz w:val="24"/>
+          <w:szCs w:val="24"/>
+          <w:lang w:val="en-US"/>
+        </w:rPr>
+        <w:t xml:space="preserve"> CPU </w:t>
+      </w:r>
+      <w:r>
+        <w:rPr>
+          <w:rFonts w:ascii="Times New Roman" w:hAnsi="Times New Roman" w:eastAsia="Times New Roman" w:cs="Times New Roman"/>
+          <w:noProof w:val="0"/>
+          <w:sz w:val="24"/>
+          <w:szCs w:val="24"/>
+          <w:lang w:val="en-US"/>
+        </w:rPr>
+        <w:t>runtime</w:t>
+      </w:r>
+      <w:r>
+        <w:rPr>
+          <w:rFonts w:ascii="Times New Roman" w:hAnsi="Times New Roman" w:eastAsia="Times New Roman" w:cs="Times New Roman"/>
+          <w:noProof w:val="0"/>
+          <w:sz w:val="24"/>
+          <w:szCs w:val="24"/>
+          <w:lang w:val="en-US"/>
+        </w:rPr>
+        <w:t xml:space="preserve"> a full run from CSV to the final evaluation tables takes under half an hour including preprocessing, and the training phase alone takes </w:t>
+      </w:r>
+      <w:r>
+        <w:rPr>
+          <w:rFonts w:ascii="Times New Roman" w:hAnsi="Times New Roman" w:eastAsia="Times New Roman" w:cs="Times New Roman"/>
+          <w:noProof w:val="0"/>
+          <w:sz w:val="24"/>
+          <w:szCs w:val="24"/>
+          <w:lang w:val="en-US"/>
+        </w:rPr>
+        <w:t>roughly six</w:t>
+      </w:r>
+      <w:r>
+        <w:rPr>
+          <w:rFonts w:ascii="Times New Roman" w:hAnsi="Times New Roman" w:eastAsia="Times New Roman" w:cs="Times New Roman"/>
+          <w:noProof w:val="0"/>
+          <w:sz w:val="24"/>
+          <w:szCs w:val="24"/>
+          <w:lang w:val="en-US"/>
+        </w:rPr>
+        <w:t xml:space="preserve"> to ten minutes with the </w:t>
+      </w:r>
+      <w:r>
+        <w:rPr>
+          <w:rFonts w:ascii="Times New Roman" w:hAnsi="Times New Roman" w:eastAsia="Times New Roman" w:cs="Times New Roman"/>
+          <w:noProof w:val="0"/>
+          <w:sz w:val="24"/>
+          <w:szCs w:val="24"/>
+          <w:lang w:val="en-US"/>
+        </w:rPr>
+        <w:t>optimisations</w:t>
+      </w:r>
+      <w:r>
+        <w:rPr>
+          <w:rFonts w:ascii="Times New Roman" w:hAnsi="Times New Roman" w:eastAsia="Times New Roman" w:cs="Times New Roman"/>
+          <w:noProof w:val="0"/>
+          <w:sz w:val="24"/>
+          <w:szCs w:val="24"/>
+          <w:lang w:val="en-US"/>
+        </w:rPr>
+        <w:t xml:space="preserve"> described in Section 4.2. The notebook, the </w:t>
+      </w:r>
+      <w:r>
+        <w:rPr>
+          <w:rFonts w:ascii="Times New Roman" w:hAnsi="Times New Roman" w:eastAsia="Times New Roman" w:cs="Times New Roman"/>
+          <w:noProof w:val="0"/>
+          <w:sz w:val="24"/>
+          <w:szCs w:val="24"/>
+          <w:lang w:val="en-US"/>
+        </w:rPr>
+        <w:t>dataset</w:t>
+      </w:r>
+      <w:r>
+        <w:rPr>
+          <w:rFonts w:ascii="Times New Roman" w:hAnsi="Times New Roman" w:eastAsia="Times New Roman" w:cs="Times New Roman"/>
+          <w:noProof w:val="0"/>
+          <w:sz w:val="24"/>
+          <w:szCs w:val="24"/>
+          <w:lang w:val="en-US"/>
+        </w:rPr>
+        <w:t xml:space="preserve"> and this report form the complete submission package.</w:t>
+      </w:r>
+    </w:p>
+    <w:p>
+      <w:pPr>
+        <w:keepNext w:val="1"/>
+        <w:ind/>
+      </w:pPr>
+      <w:r>
+        <w:br w:type="page"/>
+      </w:r>
+    </w:p>
+    <w:p>
+      <w:pPr>
+        <w:pStyle w:val="Normal"/>
+        <w:keepNext w:val="1"/>
+        <w:spacing w:before="120" w:beforeAutospacing="off" w:after="120" w:afterAutospacing="off"/>
+        <w:ind w:left="0" w:firstLine="0"/>
         <w:jc w:val="center"/>
       </w:pPr>
       <w:r>

</xml_diff>